<commit_message>
Capacitors, cleaning up, resistors 0.1%, everything discussed during 30.01.25 meeting changed
</commit_message>
<xml_diff>
--- a/Meeting_Minutes(TemporarilyHere)/Meeting Minutes 30.01.25.docx
+++ b/Meeting_Minutes(TemporarilyHere)/Meeting Minutes 30.01.25.docx
@@ -49,21 +49,7 @@
         <w:rPr>
           <w:lang w:val="en-DE"/>
         </w:rPr>
-        <w:t xml:space="preserve">But I just used a generic model TPS7A20 for the Altium schematic and footprint. Is this okay?? How will the </w:t>
-      </w:r>
-      <w:proofErr w:type="spellStart"/>
-      <w:r>
-        <w:rPr>
-          <w:lang w:val="en-DE"/>
-        </w:rPr>
-        <w:t>manufactuerers</w:t>
-      </w:r>
-      <w:proofErr w:type="spellEnd"/>
-      <w:r>
-        <w:rPr>
-          <w:lang w:val="en-DE"/>
-        </w:rPr>
-        <w:t xml:space="preserve"> know it’s the 3.3V output specific model? Through our schematic?</w:t>
+        <w:t>But I just used a generic model TPS7A20 for the Altium schematic and footprint. Is this okay?? How will the manufactuerers know it’s the 3.3V output specific model? Through our schematic?</w:t>
       </w:r>
     </w:p>
     <w:p>
@@ -83,35 +69,7 @@
         <w:rPr>
           <w:lang w:val="en-DE"/>
         </w:rPr>
-        <w:t xml:space="preserve">NVM </w:t>
-      </w:r>
-      <w:proofErr w:type="spellStart"/>
-      <w:r>
-        <w:rPr>
-          <w:lang w:val="en-DE"/>
-        </w:rPr>
-        <w:t>i</w:t>
-      </w:r>
-      <w:proofErr w:type="spellEnd"/>
-      <w:r>
-        <w:rPr>
-          <w:lang w:val="en-DE"/>
-        </w:rPr>
-        <w:t xml:space="preserve"> got the 3.3V version through </w:t>
-      </w:r>
-      <w:proofErr w:type="spellStart"/>
-      <w:r>
-        <w:rPr>
-          <w:lang w:val="en-DE"/>
-        </w:rPr>
-        <w:t>Ultrarian</w:t>
-      </w:r>
-      <w:proofErr w:type="spellEnd"/>
-      <w:r>
-        <w:rPr>
-          <w:lang w:val="en-DE"/>
-        </w:rPr>
-        <w:t xml:space="preserve"> Library</w:t>
+        <w:t>NVM i got the 3.3V version through Ultrarian Library</w:t>
       </w:r>
     </w:p>
     <w:p>
@@ -235,6 +193,403 @@
       </w:pPr>
       <w:r>
         <w:t>Final check to make sure if possible same model components are used</w:t>
+      </w:r>
+    </w:p>
+    <w:p/>
+    <w:p/>
+    <w:p>
+      <w:r>
+        <w:t>Meeting Minutes</w:t>
+      </w:r>
+    </w:p>
+    <w:p>
+      <w:r>
+        <w:t>Capacitance</w:t>
+      </w:r>
+    </w:p>
+    <w:p>
+      <w:pPr>
+        <w:pStyle w:val="ListParagraph"/>
+        <w:numPr>
+          <w:ilvl w:val="0"/>
+          <w:numId w:val="1"/>
+        </w:numPr>
+      </w:pPr>
+      <w:r>
+        <w:t>General rule of thumb – all ICs add like 100nF in the input</w:t>
+      </w:r>
+    </w:p>
+    <w:p>
+      <w:pPr>
+        <w:pStyle w:val="ListParagraph"/>
+        <w:numPr>
+          <w:ilvl w:val="0"/>
+          <w:numId w:val="1"/>
+        </w:numPr>
+      </w:pPr>
+      <w:r>
+        <w:t>Our power</w:t>
+      </w:r>
+    </w:p>
+    <w:p>
+      <w:pPr>
+        <w:pStyle w:val="ListParagraph"/>
+        <w:numPr>
+          <w:ilvl w:val="1"/>
+          <w:numId w:val="1"/>
+        </w:numPr>
+      </w:pPr>
+      <w:r>
+        <w:t xml:space="preserve">100nF and add 1uF in the input </w:t>
+      </w:r>
+    </w:p>
+    <w:p>
+      <w:pPr>
+        <w:pStyle w:val="ListParagraph"/>
+        <w:numPr>
+          <w:ilvl w:val="0"/>
+          <w:numId w:val="1"/>
+        </w:numPr>
+      </w:pPr>
+      <w:r>
+        <w:t>For all of the components</w:t>
+      </w:r>
+    </w:p>
+    <w:p>
+      <w:pPr>
+        <w:pStyle w:val="ListParagraph"/>
+        <w:numPr>
+          <w:ilvl w:val="1"/>
+          <w:numId w:val="1"/>
+        </w:numPr>
+      </w:pPr>
+      <w:r>
+        <w:t>Add capacitace for all the components</w:t>
+      </w:r>
+    </w:p>
+    <w:p>
+      <w:pPr>
+        <w:pStyle w:val="ListParagraph"/>
+        <w:numPr>
+          <w:ilvl w:val="0"/>
+          <w:numId w:val="1"/>
+        </w:numPr>
+      </w:pPr>
+      <w:r>
+        <w:t>Change all the 0.1uF to 100nF</w:t>
+      </w:r>
+    </w:p>
+    <w:p>
+      <w:pPr>
+        <w:pStyle w:val="ListParagraph"/>
+        <w:numPr>
+          <w:ilvl w:val="0"/>
+          <w:numId w:val="1"/>
+        </w:numPr>
+      </w:pPr>
+      <w:r>
+        <w:t>E96 resistor line</w:t>
+      </w:r>
+    </w:p>
+    <w:p/>
+    <w:p>
+      <w:r>
+        <w:t>Feedback for Op amps</w:t>
+      </w:r>
+    </w:p>
+    <w:p>
+      <w:pPr>
+        <w:pStyle w:val="ListParagraph"/>
+        <w:numPr>
+          <w:ilvl w:val="0"/>
+          <w:numId w:val="1"/>
+        </w:numPr>
+      </w:pPr>
+      <w:r>
+        <w:t xml:space="preserve">6k65 0.1% and 10k </w:t>
+      </w:r>
+      <w:r>
+        <w:rPr>
+          <w:b/>
+          <w:bCs/>
+        </w:rPr>
+        <w:t>0603</w:t>
+      </w:r>
+      <w:r>
+        <w:t xml:space="preserve"> package size</w:t>
+      </w:r>
+    </w:p>
+    <w:p>
+      <w:pPr>
+        <w:pStyle w:val="ListParagraph"/>
+        <w:numPr>
+          <w:ilvl w:val="1"/>
+          <w:numId w:val="1"/>
+        </w:numPr>
+      </w:pPr>
+      <w:r>
+        <w:t>On DBeaver</w:t>
+      </w:r>
+    </w:p>
+    <w:p>
+      <w:pPr>
+        <w:pStyle w:val="ListParagraph"/>
+        <w:numPr>
+          <w:ilvl w:val="2"/>
+          <w:numId w:val="1"/>
+        </w:numPr>
+      </w:pPr>
+      <w:r>
+        <w:t>Find 0603 package size resistor, change all the parameters for 6k65 and 0.1%</w:t>
+      </w:r>
+    </w:p>
+    <w:p>
+      <w:pPr>
+        <w:pStyle w:val="ListParagraph"/>
+        <w:numPr>
+          <w:ilvl w:val="3"/>
+          <w:numId w:val="1"/>
+        </w:numPr>
+      </w:pPr>
+      <w:r>
+        <w:t xml:space="preserve">Take parameters from </w:t>
+      </w:r>
+      <w:hyperlink r:id="rId5" w:history="1">
+        <w:r>
+          <w:rPr>
+            <w:rStyle w:val="Hyperlink"/>
+          </w:rPr>
+          <w:t>https://jlcpcb.com/partdetail/Yageo-RT0603BRD076K65L/C861536</w:t>
+        </w:r>
+      </w:hyperlink>
+      <w:r>
+        <w:t xml:space="preserve"> </w:t>
+      </w:r>
+    </w:p>
+    <w:p>
+      <w:pPr>
+        <w:pStyle w:val="ListParagraph"/>
+        <w:numPr>
+          <w:ilvl w:val="2"/>
+          <w:numId w:val="1"/>
+        </w:numPr>
+      </w:pPr>
+      <w:r>
+        <w:t>And then it will appear on Altium</w:t>
+      </w:r>
+    </w:p>
+    <w:p>
+      <w:pPr>
+        <w:pStyle w:val="ListParagraph"/>
+        <w:numPr>
+          <w:ilvl w:val="1"/>
+          <w:numId w:val="1"/>
+        </w:numPr>
+      </w:pPr>
+      <w:r>
+        <w:t>Change the 10k resistors to 0.1% as well</w:t>
+      </w:r>
+    </w:p>
+    <w:p>
+      <w:r>
+        <w:t xml:space="preserve">Clean up the connector sheet – readable </w:t>
+      </w:r>
+    </w:p>
+    <w:p>
+      <w:r>
+        <w:t>Shortcut to see what everything is connected to – alt + click.</w:t>
+      </w:r>
+    </w:p>
+    <w:p/>
+    <w:p>
+      <w:r>
+        <w:t>2 layer PCB or 4 layer PCB look at what is better</w:t>
+      </w:r>
+    </w:p>
+    <w:p>
+      <w:pPr>
+        <w:pStyle w:val="ListParagraph"/>
+        <w:numPr>
+          <w:ilvl w:val="0"/>
+          <w:numId w:val="1"/>
+        </w:numPr>
+      </w:pPr>
+      <w:r>
+        <w:t>4 layer seems likely</w:t>
+      </w:r>
+    </w:p>
+    <w:p>
+      <w:pPr>
+        <w:pStyle w:val="ListParagraph"/>
+        <w:numPr>
+          <w:ilvl w:val="0"/>
+          <w:numId w:val="1"/>
+        </w:numPr>
+      </w:pPr>
+      <w:hyperlink r:id="rId6" w:history="1">
+        <w:r>
+          <w:rPr>
+            <w:rStyle w:val="Hyperlink"/>
+          </w:rPr>
+          <w:t>https://jlcpcb.com/capabilities/pcb</w:t>
+        </w:r>
+        <w:r>
+          <w:rPr>
+            <w:rStyle w:val="Hyperlink"/>
+          </w:rPr>
+          <w:t>-</w:t>
+        </w:r>
+        <w:r>
+          <w:rPr>
+            <w:rStyle w:val="Hyperlink"/>
+          </w:rPr>
+          <w:t>capabilities</w:t>
+        </w:r>
+      </w:hyperlink>
+      <w:r>
+        <w:t xml:space="preserve"> </w:t>
+      </w:r>
+    </w:p>
+    <w:p>
+      <w:r>
+        <w:t>Ideally, return current flows back in the same way it came – just on a different layer</w:t>
+      </w:r>
+    </w:p>
+    <w:p>
+      <w:r>
+        <w:t>Ideally current passes through all the capacitors – place vias in a way that this happens</w:t>
+      </w:r>
+    </w:p>
+    <w:p>
+      <w:r>
+        <w:t>ToDos:</w:t>
+      </w:r>
+    </w:p>
+    <w:p>
+      <w:pPr>
+        <w:pStyle w:val="ListParagraph"/>
+        <w:numPr>
+          <w:ilvl w:val="0"/>
+          <w:numId w:val="1"/>
+        </w:numPr>
+      </w:pPr>
+      <w:r>
+        <w:t>Rooms feature to layout pcb</w:t>
+      </w:r>
+    </w:p>
+    <w:p>
+      <w:pPr>
+        <w:pStyle w:val="ListParagraph"/>
+        <w:numPr>
+          <w:ilvl w:val="1"/>
+          <w:numId w:val="1"/>
+        </w:numPr>
+      </w:pPr>
+      <w:r>
+        <w:t>For vias 10mil uaually quite big</w:t>
+      </w:r>
+    </w:p>
+    <w:p>
+      <w:pPr>
+        <w:pStyle w:val="ListParagraph"/>
+        <w:numPr>
+          <w:ilvl w:val="0"/>
+          <w:numId w:val="1"/>
+        </w:numPr>
+      </w:pPr>
+      <w:r>
+        <w:t>Ideally set the rules looking at the jlcpcb capabilities</w:t>
+      </w:r>
+    </w:p>
+    <w:p>
+      <w:pPr>
+        <w:pStyle w:val="ListParagraph"/>
+        <w:numPr>
+          <w:ilvl w:val="1"/>
+          <w:numId w:val="1"/>
+        </w:numPr>
+      </w:pPr>
+      <w:r>
+        <w:t>Github rules for the jlc rules</w:t>
+      </w:r>
+    </w:p>
+    <w:p>
+      <w:pPr>
+        <w:pStyle w:val="ListParagraph"/>
+        <w:numPr>
+          <w:ilvl w:val="2"/>
+          <w:numId w:val="1"/>
+        </w:numPr>
+      </w:pPr>
+      <w:hyperlink r:id="rId7" w:history="1">
+        <w:r>
+          <w:rPr>
+            <w:rStyle w:val="Hyperlink"/>
+          </w:rPr>
+          <w:t>https://github.com/ayberkozgur/jlcpcb-design-rules-stackups/tree/master/design-rules/altium</w:t>
+        </w:r>
+      </w:hyperlink>
+    </w:p>
+    <w:p>
+      <w:pPr>
+        <w:pStyle w:val="ListParagraph"/>
+        <w:numPr>
+          <w:ilvl w:val="2"/>
+          <w:numId w:val="1"/>
+        </w:numPr>
+      </w:pPr>
+      <w:r>
+        <w:t xml:space="preserve">Import </w:t>
+      </w:r>
+      <w:hyperlink r:id="rId8" w:tooltip="4layer-1oz.RUL" w:history="1">
+        <w:r>
+          <w:rPr>
+            <w:rStyle w:val="Hyperlink"/>
+          </w:rPr>
+          <w:t>4layer-1oz.RUL</w:t>
+        </w:r>
+      </w:hyperlink>
+      <w:r>
+        <w:t xml:space="preserve"> rules</w:t>
+      </w:r>
+    </w:p>
+    <w:p>
+      <w:pPr>
+        <w:pStyle w:val="ListParagraph"/>
+        <w:numPr>
+          <w:ilvl w:val="0"/>
+          <w:numId w:val="1"/>
+        </w:numPr>
+      </w:pPr>
+      <w:r>
+        <w:t>Also check all components and make sure they are available in JLCPCB</w:t>
+      </w:r>
+      <w:r>
+        <w:t>/LCSC</w:t>
+      </w:r>
+    </w:p>
+    <w:p>
+      <w:pPr>
+        <w:pStyle w:val="ListParagraph"/>
+        <w:numPr>
+          <w:ilvl w:val="1"/>
+          <w:numId w:val="1"/>
+        </w:numPr>
+      </w:pPr>
+      <w:r>
+        <w:t>Price as well</w:t>
+      </w:r>
+    </w:p>
+    <w:p>
+      <w:pPr>
+        <w:pStyle w:val="ListParagraph"/>
+        <w:numPr>
+          <w:ilvl w:val="1"/>
+          <w:numId w:val="1"/>
+        </w:numPr>
+      </w:pPr>
+      <w:r>
+        <w:t>If not chose something similar that is available</w:t>
       </w:r>
     </w:p>
     <w:sectPr>
@@ -276,7 +631,7 @@
         <w:rFonts w:ascii="Courier New" w:hAnsi="Courier New" w:cs="Courier New" w:hint="default"/>
       </w:rPr>
     </w:lvl>
-    <w:lvl w:ilvl="2" w:tplc="20000005" w:tentative="1">
+    <w:lvl w:ilvl="2" w:tplc="20000005">
       <w:start w:val="1"/>
       <w:numFmt w:val="bullet"/>
       <w:lvlText w:val=""/>
@@ -288,7 +643,7 @@
         <w:rFonts w:ascii="Wingdings" w:hAnsi="Wingdings" w:hint="default"/>
       </w:rPr>
     </w:lvl>
-    <w:lvl w:ilvl="3" w:tplc="20000001" w:tentative="1">
+    <w:lvl w:ilvl="3" w:tplc="20000001">
       <w:start w:val="1"/>
       <w:numFmt w:val="bullet"/>
       <w:lvlText w:val=""/>
@@ -1297,6 +1652,41 @@
       <w:spacing w:val="5"/>
     </w:rPr>
   </w:style>
+  <w:style w:type="character" w:styleId="Hyperlink">
+    <w:name w:val="Hyperlink"/>
+    <w:basedOn w:val="DefaultParagraphFont"/>
+    <w:uiPriority w:val="99"/>
+    <w:unhideWhenUsed/>
+    <w:rsid w:val="00DB5775"/>
+    <w:rPr>
+      <w:color w:val="467886" w:themeColor="hyperlink"/>
+      <w:u w:val="single"/>
+    </w:rPr>
+  </w:style>
+  <w:style w:type="character" w:styleId="UnresolvedMention">
+    <w:name w:val="Unresolved Mention"/>
+    <w:basedOn w:val="DefaultParagraphFont"/>
+    <w:uiPriority w:val="99"/>
+    <w:semiHidden/>
+    <w:unhideWhenUsed/>
+    <w:rsid w:val="00DB5775"/>
+    <w:rPr>
+      <w:color w:val="605E5C"/>
+      <w:shd w:val="clear" w:color="auto" w:fill="E1DFDD"/>
+    </w:rPr>
+  </w:style>
+  <w:style w:type="character" w:styleId="FollowedHyperlink">
+    <w:name w:val="FollowedHyperlink"/>
+    <w:basedOn w:val="DefaultParagraphFont"/>
+    <w:uiPriority w:val="99"/>
+    <w:semiHidden/>
+    <w:unhideWhenUsed/>
+    <w:rsid w:val="00C92B25"/>
+    <w:rPr>
+      <w:color w:val="96607D" w:themeColor="followedHyperlink"/>
+      <w:u w:val="single"/>
+    </w:rPr>
+  </w:style>
 </w:styles>
 </file>
 

</xml_diff>

<commit_message>
diode resistors - is this correct?
</commit_message>
<xml_diff>
--- a/Meeting_Minutes(TemporarilyHere)/Meeting Minutes 30.01.25.docx
+++ b/Meeting_Minutes(TemporarilyHere)/Meeting Minutes 30.01.25.docx
@@ -49,7 +49,21 @@
         <w:rPr>
           <w:lang w:val="en-DE"/>
         </w:rPr>
-        <w:t>But I just used a generic model TPS7A20 for the Altium schematic and footprint. Is this okay?? How will the manufactuerers know it’s the 3.3V output specific model? Through our schematic?</w:t>
+        <w:t xml:space="preserve">But I just used a generic model TPS7A20 for the Altium schematic and footprint. Is this okay?? How will the </w:t>
+      </w:r>
+      <w:proofErr w:type="spellStart"/>
+      <w:r>
+        <w:rPr>
+          <w:lang w:val="en-DE"/>
+        </w:rPr>
+        <w:t>manufactuerers</w:t>
+      </w:r>
+      <w:proofErr w:type="spellEnd"/>
+      <w:r>
+        <w:rPr>
+          <w:lang w:val="en-DE"/>
+        </w:rPr>
+        <w:t xml:space="preserve"> know it’s the 3.3V output specific model? Through our schematic?</w:t>
       </w:r>
     </w:p>
     <w:p>
@@ -69,7 +83,35 @@
         <w:rPr>
           <w:lang w:val="en-DE"/>
         </w:rPr>
-        <w:t>NVM i got the 3.3V version through Ultrarian Library</w:t>
+        <w:t xml:space="preserve">NVM </w:t>
+      </w:r>
+      <w:proofErr w:type="spellStart"/>
+      <w:r>
+        <w:rPr>
+          <w:lang w:val="en-DE"/>
+        </w:rPr>
+        <w:t>i</w:t>
+      </w:r>
+      <w:proofErr w:type="spellEnd"/>
+      <w:r>
+        <w:rPr>
+          <w:lang w:val="en-DE"/>
+        </w:rPr>
+        <w:t xml:space="preserve"> got the 3.3V version through </w:t>
+      </w:r>
+      <w:proofErr w:type="spellStart"/>
+      <w:r>
+        <w:rPr>
+          <w:lang w:val="en-DE"/>
+        </w:rPr>
+        <w:t>Ultrarian</w:t>
+      </w:r>
+      <w:proofErr w:type="spellEnd"/>
+      <w:r>
+        <w:rPr>
+          <w:lang w:val="en-DE"/>
+        </w:rPr>
+        <w:t xml:space="preserve"> Library</w:t>
       </w:r>
     </w:p>
     <w:p>
@@ -242,6 +284,15 @@
       <w:r>
         <w:t xml:space="preserve">100nF and add 1uF in the input </w:t>
       </w:r>
+      <w:r>
+        <w:rPr>
+          <w:rFonts w:ascii="Segoe UI Emoji" w:hAnsi="Segoe UI Emoji" w:cs="Segoe UI Emoji"/>
+        </w:rPr>
+        <w:t>✅</w:t>
+      </w:r>
+      <w:r>
+        <w:t xml:space="preserve"> 1uF first and then the 100nF</w:t>
+      </w:r>
     </w:p>
     <w:p>
       <w:pPr>
@@ -264,7 +315,15 @@
         </w:numPr>
       </w:pPr>
       <w:r>
-        <w:t>Add capacitace for all the components</w:t>
+        <w:t xml:space="preserve">Add </w:t>
+      </w:r>
+      <w:proofErr w:type="spellStart"/>
+      <w:r>
+        <w:t>capacitace</w:t>
+      </w:r>
+      <w:proofErr w:type="spellEnd"/>
+      <w:r>
+        <w:t xml:space="preserve"> for all the components</w:t>
       </w:r>
     </w:p>
     <w:p>
@@ -277,6 +336,18 @@
       </w:pPr>
       <w:r>
         <w:t>Change all the 0.1uF to 100nF</w:t>
+      </w:r>
+      <w:r>
+        <w:rPr>
+          <w:rFonts w:ascii="Segoe UI Emoji" w:hAnsi="Segoe UI Emoji" w:cs="Calibri"/>
+        </w:rPr>
+        <w:t xml:space="preserve"> </w:t>
+      </w:r>
+      <w:r>
+        <w:rPr>
+          <w:rFonts w:ascii="Segoe UI Emoji" w:hAnsi="Segoe UI Emoji" w:cs="Segoe UI Emoji"/>
+        </w:rPr>
+        <w:t>✅</w:t>
       </w:r>
     </w:p>
     <w:p>
@@ -328,8 +399,13 @@
         </w:numPr>
       </w:pPr>
       <w:r>
-        <w:t>On DBeaver</w:t>
-      </w:r>
+        <w:t xml:space="preserve">On </w:t>
+      </w:r>
+      <w:proofErr w:type="spellStart"/>
+      <w:r>
+        <w:t>DBeaver</w:t>
+      </w:r>
+      <w:proofErr w:type="spellEnd"/>
     </w:p>
     <w:p>
       <w:pPr>
@@ -341,6 +417,18 @@
       </w:pPr>
       <w:r>
         <w:t>Find 0603 package size resistor, change all the parameters for 6k65 and 0.1%</w:t>
+      </w:r>
+      <w:r>
+        <w:rPr>
+          <w:rFonts w:ascii="Segoe UI Emoji" w:hAnsi="Segoe UI Emoji" w:cs="Calibri"/>
+        </w:rPr>
+        <w:t xml:space="preserve"> </w:t>
+      </w:r>
+      <w:r>
+        <w:rPr>
+          <w:rFonts w:ascii="Segoe UI Emoji" w:hAnsi="Segoe UI Emoji" w:cs="Segoe UI Emoji"/>
+        </w:rPr>
+        <w:t>✅</w:t>
       </w:r>
     </w:p>
     <w:p>
@@ -359,12 +447,30 @@
           <w:rPr>
             <w:rStyle w:val="Hyperlink"/>
           </w:rPr>
-          <w:t>https://jlcpcb.com/partdetail/Yageo-RT0603BRD076K65L/C861536</w:t>
+          <w:t>https://jlcpc</w:t>
+        </w:r>
+        <w:r>
+          <w:rPr>
+            <w:rStyle w:val="Hyperlink"/>
+          </w:rPr>
+          <w:t>b</w:t>
+        </w:r>
+        <w:r>
+          <w:rPr>
+            <w:rStyle w:val="Hyperlink"/>
+          </w:rPr>
+          <w:t>.com/partdetail/Yageo-RT0603BRD076K65L/C861536</w:t>
         </w:r>
       </w:hyperlink>
       <w:r>
         <w:t xml:space="preserve"> </w:t>
       </w:r>
+      <w:r>
+        <w:rPr>
+          <w:rFonts w:ascii="Segoe UI Emoji" w:hAnsi="Segoe UI Emoji" w:cs="Segoe UI Emoji"/>
+        </w:rPr>
+        <w:t>✅</w:t>
+      </w:r>
     </w:p>
     <w:p>
       <w:pPr>
@@ -377,6 +483,18 @@
       <w:r>
         <w:t>And then it will appear on Altium</w:t>
       </w:r>
+      <w:r>
+        <w:rPr>
+          <w:rFonts w:ascii="Segoe UI Emoji" w:hAnsi="Segoe UI Emoji" w:cs="Calibri"/>
+        </w:rPr>
+        <w:t xml:space="preserve"> </w:t>
+      </w:r>
+      <w:r>
+        <w:rPr>
+          <w:rFonts w:ascii="Segoe UI Emoji" w:hAnsi="Segoe UI Emoji" w:cs="Segoe UI Emoji"/>
+        </w:rPr>
+        <w:t>✅</w:t>
+      </w:r>
     </w:p>
     <w:p>
       <w:pPr>
@@ -389,11 +507,29 @@
       <w:r>
         <w:t>Change the 10k resistors to 0.1% as well</w:t>
       </w:r>
+      <w:r>
+        <w:rPr>
+          <w:rFonts w:ascii="Segoe UI Emoji" w:hAnsi="Segoe UI Emoji" w:cs="Calibri"/>
+        </w:rPr>
+        <w:t xml:space="preserve"> </w:t>
+      </w:r>
+      <w:r>
+        <w:rPr>
+          <w:rFonts w:ascii="Segoe UI Emoji" w:hAnsi="Segoe UI Emoji" w:cs="Segoe UI Emoji"/>
+        </w:rPr>
+        <w:t>✅</w:t>
+      </w:r>
     </w:p>
     <w:p>
       <w:r>
         <w:t xml:space="preserve">Clean up the connector sheet – readable </w:t>
       </w:r>
+      <w:r>
+        <w:rPr>
+          <w:rFonts w:ascii="Segoe UI Emoji" w:hAnsi="Segoe UI Emoji" w:cs="Segoe UI Emoji"/>
+        </w:rPr>
+        <w:t>✅</w:t>
+      </w:r>
     </w:p>
     <w:p>
       <w:r>
@@ -402,7 +538,17 @@
     </w:p>
     <w:p/>
     <w:p>
-      <w:r>
+      <w:pPr>
+        <w:rPr>
+          <w:b/>
+          <w:bCs/>
+        </w:rPr>
+      </w:pPr>
+      <w:r>
+        <w:rPr>
+          <w:b/>
+          <w:bCs/>
+        </w:rPr>
         <w:t>2 layer PCB or 4 layer PCB look at what is better</w:t>
       </w:r>
     </w:p>
@@ -413,8 +559,16 @@
           <w:ilvl w:val="0"/>
           <w:numId w:val="1"/>
         </w:numPr>
-      </w:pPr>
-      <w:r>
+        <w:rPr>
+          <w:b/>
+          <w:bCs/>
+        </w:rPr>
+      </w:pPr>
+      <w:r>
+        <w:rPr>
+          <w:b/>
+          <w:bCs/>
+        </w:rPr>
         <w:t>4 layer seems likely</w:t>
       </w:r>
     </w:p>
@@ -425,42 +579,107 @@
           <w:ilvl w:val="0"/>
           <w:numId w:val="1"/>
         </w:numPr>
+        <w:rPr>
+          <w:b/>
+          <w:bCs/>
+        </w:rPr>
       </w:pPr>
       <w:hyperlink r:id="rId6" w:history="1">
         <w:r>
           <w:rPr>
             <w:rStyle w:val="Hyperlink"/>
+            <w:b/>
+            <w:bCs/>
           </w:rPr>
           <w:t>https://jlcpcb.com/capabilities/pcb</w:t>
         </w:r>
         <w:r>
           <w:rPr>
             <w:rStyle w:val="Hyperlink"/>
+            <w:b/>
+            <w:bCs/>
           </w:rPr>
           <w:t>-</w:t>
         </w:r>
         <w:r>
           <w:rPr>
             <w:rStyle w:val="Hyperlink"/>
+            <w:b/>
+            <w:bCs/>
           </w:rPr>
           <w:t>capabilities</w:t>
         </w:r>
       </w:hyperlink>
       <w:r>
+        <w:rPr>
+          <w:b/>
+          <w:bCs/>
+        </w:rPr>
         <w:t xml:space="preserve"> </w:t>
       </w:r>
     </w:p>
     <w:p>
-      <w:r>
+      <w:pPr>
+        <w:rPr>
+          <w:b/>
+          <w:bCs/>
+        </w:rPr>
+      </w:pPr>
+      <w:r>
+        <w:rPr>
+          <w:b/>
+          <w:bCs/>
+        </w:rPr>
         <w:t>Ideally, return current flows back in the same way it came – just on a different layer</w:t>
       </w:r>
     </w:p>
     <w:p>
-      <w:r>
+      <w:pPr>
+        <w:rPr>
+          <w:b/>
+          <w:bCs/>
+        </w:rPr>
+      </w:pPr>
+      <w:r>
+        <w:rPr>
+          <w:b/>
+          <w:bCs/>
+        </w:rPr>
         <w:t>Ideally current passes through all the capacitors – place vias in a way that this happens</w:t>
       </w:r>
     </w:p>
     <w:p>
+      <w:pPr>
+        <w:rPr>
+          <w:b/>
+          <w:bCs/>
+        </w:rPr>
+      </w:pPr>
+      <w:r>
+        <w:rPr>
+          <w:b/>
+          <w:bCs/>
+        </w:rPr>
+        <w:t>Make sure all layers have a similar amount of copper – to prevent bending</w:t>
+      </w:r>
+    </w:p>
+    <w:p>
+      <w:pPr>
+        <w:rPr>
+          <w:b/>
+          <w:bCs/>
+        </w:rPr>
+      </w:pPr>
+      <w:r>
+        <w:rPr>
+          <w:b/>
+          <w:bCs/>
+        </w:rPr>
+        <w:t>For PCB layout, for the specific ICs, look at the data sheets for inspiration</w:t>
+      </w:r>
+    </w:p>
+    <w:p/>
+    <w:p>
       <w:r>
         <w:t>ToDos:</w:t>
       </w:r>
@@ -474,8 +693,13 @@
         </w:numPr>
       </w:pPr>
       <w:r>
-        <w:t>Rooms feature to layout pcb</w:t>
-      </w:r>
+        <w:t xml:space="preserve">Rooms feature to layout </w:t>
+      </w:r>
+      <w:proofErr w:type="spellStart"/>
+      <w:r>
+        <w:t>pcb</w:t>
+      </w:r>
+      <w:proofErr w:type="spellEnd"/>
     </w:p>
     <w:p>
       <w:pPr>
@@ -486,7 +710,15 @@
         </w:numPr>
       </w:pPr>
       <w:r>
-        <w:t>For vias 10mil uaually quite big</w:t>
+        <w:t xml:space="preserve">For vias 10mil </w:t>
+      </w:r>
+      <w:proofErr w:type="spellStart"/>
+      <w:r>
+        <w:t>uaually</w:t>
+      </w:r>
+      <w:proofErr w:type="spellEnd"/>
+      <w:r>
+        <w:t xml:space="preserve"> quite big</w:t>
       </w:r>
     </w:p>
     <w:p>
@@ -498,7 +730,15 @@
         </w:numPr>
       </w:pPr>
       <w:r>
-        <w:t>Ideally set the rules looking at the jlcpcb capabilities</w:t>
+        <w:t xml:space="preserve">Ideally set the rules looking at the </w:t>
+      </w:r>
+      <w:proofErr w:type="spellStart"/>
+      <w:r>
+        <w:t>jlcpcb</w:t>
+      </w:r>
+      <w:proofErr w:type="spellEnd"/>
+      <w:r>
+        <w:t xml:space="preserve"> capabilities</w:t>
       </w:r>
     </w:p>
     <w:p>
@@ -509,8 +749,21 @@
           <w:numId w:val="1"/>
         </w:numPr>
       </w:pPr>
-      <w:r>
-        <w:t>Github rules for the jlc rules</w:t>
+      <w:proofErr w:type="spellStart"/>
+      <w:r>
+        <w:t>Github</w:t>
+      </w:r>
+      <w:proofErr w:type="spellEnd"/>
+      <w:r>
+        <w:t xml:space="preserve"> rules for the </w:t>
+      </w:r>
+      <w:proofErr w:type="spellStart"/>
+      <w:r>
+        <w:t>jlc</w:t>
+      </w:r>
+      <w:proofErr w:type="spellEnd"/>
+      <w:r>
+        <w:t xml:space="preserve"> rules</w:t>
       </w:r>
     </w:p>
     <w:p>

</xml_diff>